<commit_message>
New PSM agent with FHIR mapping
</commit_message>
<xml_diff>
--- a/Documentation/HL7_IS_SysMLv2_Model_DocumentationWithDiagram.docx
+++ b/Documentation/HL7_IS_SysMLv2_Model_DocumentationWithDiagram.docx
@@ -5558,7 +5558,7 @@
       <w:bookmarkStart w:id="4" w:name="_Toc223503357"/>
       <w:r>
         <w:lastRenderedPageBreak/>
-        <w:t>2. Model Overview</w:t>
+        <w:t>Model Overview</w:t>
       </w:r>
       <w:bookmarkEnd w:id="4"/>
     </w:p>
@@ -5709,7 +5709,7 @@
       </w:pPr>
       <w:bookmarkStart w:id="5" w:name="_Toc223503358"/>
       <w:r>
-        <w:t>2.1 Package Hierarchy</w:t>
+        <w:t>Package Hierarchy</w:t>
       </w:r>
       <w:bookmarkEnd w:id="5"/>
     </w:p>
@@ -7852,11 +7852,12 @@
       <w:tblPr>
         <w:tblStyle w:val="Sfondochiaro-Colore1"/>
         <w:tblW w:w="0" w:type="auto"/>
+        <w:tblLayout w:type="fixed"/>
         <w:tblLook w:val="04A0" w:firstRow="1" w:lastRow="0" w:firstColumn="1" w:lastColumn="0" w:noHBand="0" w:noVBand="1"/>
       </w:tblPr>
       <w:tblGrid>
-        <w:gridCol w:w="2731"/>
-        <w:gridCol w:w="1561"/>
+        <w:gridCol w:w="1701"/>
+        <w:gridCol w:w="2591"/>
         <w:gridCol w:w="878"/>
         <w:gridCol w:w="3470"/>
       </w:tblGrid>
@@ -7867,7 +7868,7 @@
         <w:tc>
           <w:tcPr>
             <w:cnfStyle w:val="001000000000" w:firstRow="0" w:lastRow="0" w:firstColumn="1" w:lastColumn="0" w:oddVBand="0" w:evenVBand="0" w:oddHBand="0" w:evenHBand="0" w:firstRowFirstColumn="0" w:firstRowLastColumn="0" w:lastRowFirstColumn="0" w:lastRowLastColumn="0"/>
-            <w:tcW w:w="2160" w:type="dxa"/>
+            <w:tcW w:w="1701" w:type="dxa"/>
           </w:tcPr>
           <w:p>
             <w:r>
@@ -7877,7 +7878,7 @@
         </w:tc>
         <w:tc>
           <w:tcPr>
-            <w:tcW w:w="2160" w:type="dxa"/>
+            <w:tcW w:w="2591" w:type="dxa"/>
           </w:tcPr>
           <w:p>
             <w:pPr>
@@ -7890,7 +7891,7 @@
         </w:tc>
         <w:tc>
           <w:tcPr>
-            <w:tcW w:w="2160" w:type="dxa"/>
+            <w:tcW w:w="878" w:type="dxa"/>
           </w:tcPr>
           <w:p>
             <w:pPr>
@@ -7903,7 +7904,7 @@
         </w:tc>
         <w:tc>
           <w:tcPr>
-            <w:tcW w:w="2160" w:type="dxa"/>
+            <w:tcW w:w="3470" w:type="dxa"/>
           </w:tcPr>
           <w:p>
             <w:pPr>
@@ -7922,7 +7923,7 @@
         <w:tc>
           <w:tcPr>
             <w:cnfStyle w:val="001000000000" w:firstRow="0" w:lastRow="0" w:firstColumn="1" w:lastColumn="0" w:oddVBand="0" w:evenVBand="0" w:oddHBand="0" w:evenHBand="0" w:firstRowFirstColumn="0" w:firstRowLastColumn="0" w:lastRowFirstColumn="0" w:lastRowLastColumn="0"/>
-            <w:tcW w:w="2160" w:type="dxa"/>
+            <w:tcW w:w="1701" w:type="dxa"/>
           </w:tcPr>
           <w:p>
             <w:r>
@@ -7932,7 +7933,7 @@
         </w:tc>
         <w:tc>
           <w:tcPr>
-            <w:tcW w:w="2160" w:type="dxa"/>
+            <w:tcW w:w="2591" w:type="dxa"/>
           </w:tcPr>
           <w:p>
             <w:pPr>
@@ -7945,7 +7946,7 @@
         </w:tc>
         <w:tc>
           <w:tcPr>
-            <w:tcW w:w="2160" w:type="dxa"/>
+            <w:tcW w:w="878" w:type="dxa"/>
           </w:tcPr>
           <w:p>
             <w:pPr>
@@ -7958,7 +7959,7 @@
         </w:tc>
         <w:tc>
           <w:tcPr>
-            <w:tcW w:w="2160" w:type="dxa"/>
+            <w:tcW w:w="3470" w:type="dxa"/>
           </w:tcPr>
           <w:p>
             <w:pPr>
@@ -7974,7 +7975,7 @@
         <w:tc>
           <w:tcPr>
             <w:cnfStyle w:val="001000000000" w:firstRow="0" w:lastRow="0" w:firstColumn="1" w:lastColumn="0" w:oddVBand="0" w:evenVBand="0" w:oddHBand="0" w:evenHBand="0" w:firstRowFirstColumn="0" w:firstRowLastColumn="0" w:lastRowFirstColumn="0" w:lastRowLastColumn="0"/>
-            <w:tcW w:w="2160" w:type="dxa"/>
+            <w:tcW w:w="1701" w:type="dxa"/>
           </w:tcPr>
           <w:p>
             <w:r>
@@ -7984,7 +7985,7 @@
         </w:tc>
         <w:tc>
           <w:tcPr>
-            <w:tcW w:w="2160" w:type="dxa"/>
+            <w:tcW w:w="2591" w:type="dxa"/>
           </w:tcPr>
           <w:p>
             <w:pPr>
@@ -7997,7 +7998,7 @@
         </w:tc>
         <w:tc>
           <w:tcPr>
-            <w:tcW w:w="2160" w:type="dxa"/>
+            <w:tcW w:w="878" w:type="dxa"/>
           </w:tcPr>
           <w:p>
             <w:pPr>
@@ -8010,7 +8011,7 @@
         </w:tc>
         <w:tc>
           <w:tcPr>
-            <w:tcW w:w="2160" w:type="dxa"/>
+            <w:tcW w:w="3470" w:type="dxa"/>
           </w:tcPr>
           <w:p>
             <w:pPr>
@@ -8029,18 +8030,17 @@
         <w:tc>
           <w:tcPr>
             <w:cnfStyle w:val="001000000000" w:firstRow="0" w:lastRow="0" w:firstColumn="1" w:lastColumn="0" w:oddVBand="0" w:evenVBand="0" w:oddHBand="0" w:evenHBand="0" w:firstRowFirstColumn="0" w:firstRowLastColumn="0" w:lastRowFirstColumn="0" w:lastRowLastColumn="0"/>
-            <w:tcW w:w="2160" w:type="dxa"/>
-          </w:tcPr>
-          <w:p>
-            <w:r>
-              <w:lastRenderedPageBreak/>
+            <w:tcW w:w="1701" w:type="dxa"/>
+          </w:tcPr>
+          <w:p>
+            <w:r>
               <w:t>EntityType</w:t>
             </w:r>
           </w:p>
         </w:tc>
         <w:tc>
           <w:tcPr>
-            <w:tcW w:w="2160" w:type="dxa"/>
+            <w:tcW w:w="2591" w:type="dxa"/>
           </w:tcPr>
           <w:p>
             <w:pPr>
@@ -8053,7 +8053,7 @@
         </w:tc>
         <w:tc>
           <w:tcPr>
-            <w:tcW w:w="2160" w:type="dxa"/>
+            <w:tcW w:w="878" w:type="dxa"/>
           </w:tcPr>
           <w:p>
             <w:pPr>
@@ -8066,7 +8066,7 @@
         </w:tc>
         <w:tc>
           <w:tcPr>
-            <w:tcW w:w="2160" w:type="dxa"/>
+            <w:tcW w:w="3470" w:type="dxa"/>
           </w:tcPr>
           <w:p>
             <w:pPr>
@@ -8082,7 +8082,7 @@
         <w:tc>
           <w:tcPr>
             <w:cnfStyle w:val="001000000000" w:firstRow="0" w:lastRow="0" w:firstColumn="1" w:lastColumn="0" w:oddVBand="0" w:evenVBand="0" w:oddHBand="0" w:evenHBand="0" w:firstRowFirstColumn="0" w:firstRowLastColumn="0" w:lastRowFirstColumn="0" w:lastRowLastColumn="0"/>
-            <w:tcW w:w="2160" w:type="dxa"/>
+            <w:tcW w:w="1701" w:type="dxa"/>
           </w:tcPr>
           <w:p>
             <w:r>
@@ -8092,33 +8092,38 @@
         </w:tc>
         <w:tc>
           <w:tcPr>
-            <w:tcW w:w="2160" w:type="dxa"/>
+            <w:tcW w:w="2591" w:type="dxa"/>
           </w:tcPr>
           <w:p>
             <w:pPr>
               <w:cnfStyle w:val="000000000000" w:firstRow="0" w:lastRow="0" w:firstColumn="0" w:lastColumn="0" w:oddVBand="0" w:evenVBand="0" w:oddHBand="0" w:evenHBand="0" w:firstRowFirstColumn="0" w:firstRowLastColumn="0" w:lastRowFirstColumn="0" w:lastRowLastColumn="0"/>
             </w:pPr>
             <w:r>
-              <w:t>Bridges an EntityType and a PolicyDomain. Enables domain-specific customization ...</w:t>
-            </w:r>
-          </w:p>
-        </w:tc>
-        <w:tc>
-          <w:tcPr>
-            <w:tcW w:w="2160" w:type="dxa"/>
+              <w:t xml:space="preserve">Bridges an EntityType and a PolicyDomain. Enables </w:t>
+            </w:r>
+            <w:r>
+              <w:lastRenderedPageBreak/>
+              <w:t>domain-specific customization ...</w:t>
+            </w:r>
+          </w:p>
+        </w:tc>
+        <w:tc>
+          <w:tcPr>
+            <w:tcW w:w="878" w:type="dxa"/>
           </w:tcPr>
           <w:p>
             <w:pPr>
               <w:cnfStyle w:val="000000000000" w:firstRow="0" w:lastRow="0" w:firstColumn="0" w:lastColumn="0" w:oddVBand="0" w:evenVBand="0" w:oddHBand="0" w:evenHBand="0" w:firstRowFirstColumn="0" w:firstRowLastColumn="0" w:lastRowFirstColumn="0" w:lastRowLastColumn="0"/>
             </w:pPr>
             <w:r>
+              <w:lastRenderedPageBreak/>
               <w:t>ST-074</w:t>
             </w:r>
           </w:p>
         </w:tc>
         <w:tc>
           <w:tcPr>
-            <w:tcW w:w="2160" w:type="dxa"/>
+            <w:tcW w:w="3470" w:type="dxa"/>
           </w:tcPr>
           <w:p>
             <w:pPr>
@@ -8137,7 +8142,7 @@
         <w:tc>
           <w:tcPr>
             <w:cnfStyle w:val="001000000000" w:firstRow="0" w:lastRow="0" w:firstColumn="1" w:lastColumn="0" w:oddVBand="0" w:evenVBand="0" w:oddHBand="0" w:evenHBand="0" w:firstRowFirstColumn="0" w:firstRowLastColumn="0" w:lastRowFirstColumn="0" w:lastRowLastColumn="0"/>
-            <w:tcW w:w="2160" w:type="dxa"/>
+            <w:tcW w:w="1701" w:type="dxa"/>
           </w:tcPr>
           <w:p>
             <w:r>
@@ -8147,7 +8152,7 @@
         </w:tc>
         <w:tc>
           <w:tcPr>
-            <w:tcW w:w="2160" w:type="dxa"/>
+            <w:tcW w:w="2591" w:type="dxa"/>
           </w:tcPr>
           <w:p>
             <w:pPr>
@@ -8160,7 +8165,7 @@
         </w:tc>
         <w:tc>
           <w:tcPr>
-            <w:tcW w:w="2160" w:type="dxa"/>
+            <w:tcW w:w="878" w:type="dxa"/>
           </w:tcPr>
           <w:p>
             <w:pPr>
@@ -8173,7 +8178,7 @@
         </w:tc>
         <w:tc>
           <w:tcPr>
-            <w:tcW w:w="2160" w:type="dxa"/>
+            <w:tcW w:w="3470" w:type="dxa"/>
           </w:tcPr>
           <w:p>
             <w:pPr>
@@ -8189,7 +8194,7 @@
         <w:tc>
           <w:tcPr>
             <w:cnfStyle w:val="001000000000" w:firstRow="0" w:lastRow="0" w:firstColumn="1" w:lastColumn="0" w:oddVBand="0" w:evenVBand="0" w:oddHBand="0" w:evenHBand="0" w:firstRowFirstColumn="0" w:firstRowLastColumn="0" w:lastRowFirstColumn="0" w:lastRowLastColumn="0"/>
-            <w:tcW w:w="2160" w:type="dxa"/>
+            <w:tcW w:w="1701" w:type="dxa"/>
           </w:tcPr>
           <w:p>
             <w:r>
@@ -8199,7 +8204,7 @@
         </w:tc>
         <w:tc>
           <w:tcPr>
-            <w:tcW w:w="2160" w:type="dxa"/>
+            <w:tcW w:w="2591" w:type="dxa"/>
           </w:tcPr>
           <w:p>
             <w:pPr>
@@ -8212,7 +8217,7 @@
         </w:tc>
         <w:tc>
           <w:tcPr>
-            <w:tcW w:w="2160" w:type="dxa"/>
+            <w:tcW w:w="878" w:type="dxa"/>
           </w:tcPr>
           <w:p>
             <w:pPr>
@@ -8225,7 +8230,7 @@
         </w:tc>
         <w:tc>
           <w:tcPr>
-            <w:tcW w:w="2160" w:type="dxa"/>
+            <w:tcW w:w="3470" w:type="dxa"/>
           </w:tcPr>
           <w:p>
             <w:pPr>
@@ -8244,7 +8249,7 @@
         <w:tc>
           <w:tcPr>
             <w:cnfStyle w:val="001000000000" w:firstRow="0" w:lastRow="0" w:firstColumn="1" w:lastColumn="0" w:oddVBand="0" w:evenVBand="0" w:oddHBand="0" w:evenHBand="0" w:firstRowFirstColumn="0" w:firstRowLastColumn="0" w:lastRowFirstColumn="0" w:lastRowLastColumn="0"/>
-            <w:tcW w:w="2160" w:type="dxa"/>
+            <w:tcW w:w="1701" w:type="dxa"/>
           </w:tcPr>
           <w:p>
             <w:r>
@@ -8254,7 +8259,7 @@
         </w:tc>
         <w:tc>
           <w:tcPr>
-            <w:tcW w:w="2160" w:type="dxa"/>
+            <w:tcW w:w="2591" w:type="dxa"/>
           </w:tcPr>
           <w:p>
             <w:pPr>
@@ -8267,7 +8272,7 @@
         </w:tc>
         <w:tc>
           <w:tcPr>
-            <w:tcW w:w="2160" w:type="dxa"/>
+            <w:tcW w:w="878" w:type="dxa"/>
           </w:tcPr>
           <w:p>
             <w:pPr>
@@ -8280,7 +8285,7 @@
         </w:tc>
         <w:tc>
           <w:tcPr>
-            <w:tcW w:w="2160" w:type="dxa"/>
+            <w:tcW w:w="3470" w:type="dxa"/>
           </w:tcPr>
           <w:p>
             <w:pPr>
@@ -8296,7 +8301,7 @@
         <w:tc>
           <w:tcPr>
             <w:cnfStyle w:val="001000000000" w:firstRow="0" w:lastRow="0" w:firstColumn="1" w:lastColumn="0" w:oddVBand="0" w:evenVBand="0" w:oddHBand="0" w:evenHBand="0" w:firstRowFirstColumn="0" w:firstRowLastColumn="0" w:lastRowFirstColumn="0" w:lastRowLastColumn="0"/>
-            <w:tcW w:w="2160" w:type="dxa"/>
+            <w:tcW w:w="1701" w:type="dxa"/>
           </w:tcPr>
           <w:p>
             <w:r>
@@ -8306,7 +8311,7 @@
         </w:tc>
         <w:tc>
           <w:tcPr>
-            <w:tcW w:w="2160" w:type="dxa"/>
+            <w:tcW w:w="2591" w:type="dxa"/>
           </w:tcPr>
           <w:p>
             <w:pPr>
@@ -8319,7 +8324,7 @@
         </w:tc>
         <w:tc>
           <w:tcPr>
-            <w:tcW w:w="2160" w:type="dxa"/>
+            <w:tcW w:w="878" w:type="dxa"/>
           </w:tcPr>
           <w:p>
             <w:pPr>
@@ -8332,7 +8337,7 @@
         </w:tc>
         <w:tc>
           <w:tcPr>
-            <w:tcW w:w="2160" w:type="dxa"/>
+            <w:tcW w:w="3470" w:type="dxa"/>
           </w:tcPr>
           <w:p>
             <w:pPr>
@@ -8351,18 +8356,17 @@
         <w:tc>
           <w:tcPr>
             <w:cnfStyle w:val="001000000000" w:firstRow="0" w:lastRow="0" w:firstColumn="1" w:lastColumn="0" w:oddVBand="0" w:evenVBand="0" w:oddHBand="0" w:evenHBand="0" w:firstRowFirstColumn="0" w:firstRowLastColumn="0" w:lastRowFirstColumn="0" w:lastRowLastColumn="0"/>
-            <w:tcW w:w="2160" w:type="dxa"/>
-          </w:tcPr>
-          <w:p>
-            <w:r>
-              <w:lastRenderedPageBreak/>
+            <w:tcW w:w="1701" w:type="dxa"/>
+          </w:tcPr>
+          <w:p>
+            <w:r>
               <w:t>SearchQualifier</w:t>
             </w:r>
           </w:p>
         </w:tc>
         <w:tc>
           <w:tcPr>
-            <w:tcW w:w="2160" w:type="dxa"/>
+            <w:tcW w:w="2591" w:type="dxa"/>
           </w:tcPr>
           <w:p>
             <w:pPr>
@@ -8375,7 +8379,7 @@
         </w:tc>
         <w:tc>
           <w:tcPr>
-            <w:tcW w:w="2160" w:type="dxa"/>
+            <w:tcW w:w="878" w:type="dxa"/>
           </w:tcPr>
           <w:p>
             <w:pPr>
@@ -8388,7 +8392,7 @@
         </w:tc>
         <w:tc>
           <w:tcPr>
-            <w:tcW w:w="2160" w:type="dxa"/>
+            <w:tcW w:w="3470" w:type="dxa"/>
           </w:tcPr>
           <w:p>
             <w:pPr>
@@ -8404,7 +8408,7 @@
         <w:tc>
           <w:tcPr>
             <w:cnfStyle w:val="001000000000" w:firstRow="0" w:lastRow="0" w:firstColumn="1" w:lastColumn="0" w:oddVBand="0" w:evenVBand="0" w:oddHBand="0" w:evenHBand="0" w:firstRowFirstColumn="0" w:firstRowLastColumn="0" w:lastRowFirstColumn="0" w:lastRowLastColumn="0"/>
-            <w:tcW w:w="2160" w:type="dxa"/>
+            <w:tcW w:w="1701" w:type="dxa"/>
           </w:tcPr>
           <w:p>
             <w:r>
@@ -8414,7 +8418,7 @@
         </w:tc>
         <w:tc>
           <w:tcPr>
-            <w:tcW w:w="2160" w:type="dxa"/>
+            <w:tcW w:w="2591" w:type="dxa"/>
           </w:tcPr>
           <w:p>
             <w:pPr>
@@ -8427,7 +8431,7 @@
         </w:tc>
         <w:tc>
           <w:tcPr>
-            <w:tcW w:w="2160" w:type="dxa"/>
+            <w:tcW w:w="878" w:type="dxa"/>
           </w:tcPr>
           <w:p>
             <w:pPr>
@@ -8440,7 +8444,7 @@
         </w:tc>
         <w:tc>
           <w:tcPr>
-            <w:tcW w:w="2160" w:type="dxa"/>
+            <w:tcW w:w="3470" w:type="dxa"/>
           </w:tcPr>
           <w:p>
             <w:pPr>
@@ -8459,7 +8463,7 @@
         <w:tc>
           <w:tcPr>
             <w:cnfStyle w:val="001000000000" w:firstRow="0" w:lastRow="0" w:firstColumn="1" w:lastColumn="0" w:oddVBand="0" w:evenVBand="0" w:oddHBand="0" w:evenHBand="0" w:firstRowFirstColumn="0" w:firstRowLastColumn="0" w:lastRowFirstColumn="0" w:lastRowLastColumn="0"/>
-            <w:tcW w:w="2160" w:type="dxa"/>
+            <w:tcW w:w="1701" w:type="dxa"/>
           </w:tcPr>
           <w:p>
             <w:r>
@@ -8469,7 +8473,7 @@
         </w:tc>
         <w:tc>
           <w:tcPr>
-            <w:tcW w:w="2160" w:type="dxa"/>
+            <w:tcW w:w="2591" w:type="dxa"/>
           </w:tcPr>
           <w:p>
             <w:pPr>
@@ -8482,7 +8486,7 @@
         </w:tc>
         <w:tc>
           <w:tcPr>
-            <w:tcW w:w="2160" w:type="dxa"/>
+            <w:tcW w:w="878" w:type="dxa"/>
           </w:tcPr>
           <w:p>
             <w:pPr>
@@ -8495,7 +8499,7 @@
         </w:tc>
         <w:tc>
           <w:tcPr>
-            <w:tcW w:w="2160" w:type="dxa"/>
+            <w:tcW w:w="3470" w:type="dxa"/>
           </w:tcPr>
           <w:p>
             <w:pPr>
@@ -8511,7 +8515,7 @@
         <w:tc>
           <w:tcPr>
             <w:cnfStyle w:val="001000000000" w:firstRow="0" w:lastRow="0" w:firstColumn="1" w:lastColumn="0" w:oddVBand="0" w:evenVBand="0" w:oddHBand="0" w:evenHBand="0" w:firstRowFirstColumn="0" w:firstRowLastColumn="0" w:lastRowFirstColumn="0" w:lastRowLastColumn="0"/>
-            <w:tcW w:w="2160" w:type="dxa"/>
+            <w:tcW w:w="1701" w:type="dxa"/>
           </w:tcPr>
           <w:p>
             <w:r>
@@ -8521,7 +8525,7 @@
         </w:tc>
         <w:tc>
           <w:tcPr>
-            <w:tcW w:w="2160" w:type="dxa"/>
+            <w:tcW w:w="2591" w:type="dxa"/>
           </w:tcPr>
           <w:p>
             <w:pPr>
@@ -8534,7 +8538,7 @@
         </w:tc>
         <w:tc>
           <w:tcPr>
-            <w:tcW w:w="2160" w:type="dxa"/>
+            <w:tcW w:w="878" w:type="dxa"/>
           </w:tcPr>
           <w:p>
             <w:pPr>
@@ -8547,7 +8551,7 @@
         </w:tc>
         <w:tc>
           <w:tcPr>
-            <w:tcW w:w="2160" w:type="dxa"/>
+            <w:tcW w:w="3470" w:type="dxa"/>
           </w:tcPr>
           <w:p>
             <w:pPr>
@@ -8566,7 +8570,7 @@
         <w:tc>
           <w:tcPr>
             <w:cnfStyle w:val="001000000000" w:firstRow="0" w:lastRow="0" w:firstColumn="1" w:lastColumn="0" w:oddVBand="0" w:evenVBand="0" w:oddHBand="0" w:evenHBand="0" w:firstRowFirstColumn="0" w:firstRowLastColumn="0" w:lastRowFirstColumn="0" w:lastRowLastColumn="0"/>
-            <w:tcW w:w="2160" w:type="dxa"/>
+            <w:tcW w:w="1701" w:type="dxa"/>
           </w:tcPr>
           <w:p>
             <w:r>
@@ -8576,7 +8580,7 @@
         </w:tc>
         <w:tc>
           <w:tcPr>
-            <w:tcW w:w="2160" w:type="dxa"/>
+            <w:tcW w:w="2591" w:type="dxa"/>
           </w:tcPr>
           <w:p>
             <w:pPr>
@@ -8589,7 +8593,7 @@
         </w:tc>
         <w:tc>
           <w:tcPr>
-            <w:tcW w:w="2160" w:type="dxa"/>
+            <w:tcW w:w="878" w:type="dxa"/>
           </w:tcPr>
           <w:p>
             <w:pPr>
@@ -8602,7 +8606,7 @@
         </w:tc>
         <w:tc>
           <w:tcPr>
-            <w:tcW w:w="2160" w:type="dxa"/>
+            <w:tcW w:w="3470" w:type="dxa"/>
           </w:tcPr>
           <w:p>
             <w:pPr>
@@ -9698,7 +9702,7 @@
       <w:bookmarkStart w:id="14" w:name="_Toc223503367"/>
       <w:r>
         <w:lastRenderedPageBreak/>
-        <w:t>3.5 Domain Model (Conceptual Instance)</w:t>
+        <w:t>Domain Model (Conceptual Instance)</w:t>
       </w:r>
       <w:bookmarkEnd w:id="14"/>
     </w:p>
@@ -9716,7 +9720,7 @@
       </w:pPr>
       <w:bookmarkStart w:id="15" w:name="_Toc223503368"/>
       <w:r>
-        <w:t>4. CIM: Stakeholder Model</w:t>
+        <w:t>CIM: Stakeholder Model</w:t>
       </w:r>
       <w:bookmarkEnd w:id="15"/>
     </w:p>
@@ -9731,7 +9735,7 @@
       </w:pPr>
       <w:bookmarkStart w:id="16" w:name="_Toc223503369"/>
       <w:r>
-        <w:t>4.1 Primary Actors</w:t>
+        <w:t>Primary Actors</w:t>
       </w:r>
       <w:bookmarkEnd w:id="16"/>
     </w:p>
@@ -10131,7 +10135,7 @@
       </w:pPr>
       <w:bookmarkStart w:id="17" w:name="_Toc223503370"/>
       <w:r>
-        <w:t>4.2 Secondary Actors</w:t>
+        <w:t>Secondary Actors</w:t>
       </w:r>
       <w:bookmarkEnd w:id="17"/>
     </w:p>
@@ -10442,7 +10446,7 @@
       <w:bookmarkStart w:id="18" w:name="_Toc223503371"/>
       <w:r>
         <w:lastRenderedPageBreak/>
-        <w:t>5. CIM: Business Capabilities (Use Cases)</w:t>
+        <w:t>CIM: Business Capabilities (Use Cases)</w:t>
       </w:r>
       <w:bookmarkEnd w:id="18"/>
     </w:p>
@@ -11701,8 +11705,8 @@
       </w:tblPr>
       <w:tblGrid>
         <w:gridCol w:w="3480"/>
-        <w:gridCol w:w="2621"/>
-        <w:gridCol w:w="2539"/>
+        <w:gridCol w:w="3750"/>
+        <w:gridCol w:w="1410"/>
       </w:tblGrid>
       <w:tr>
         <w:trPr>
@@ -11711,7 +11715,7 @@
         <w:tc>
           <w:tcPr>
             <w:cnfStyle w:val="001000000000" w:firstRow="0" w:lastRow="0" w:firstColumn="1" w:lastColumn="0" w:oddVBand="0" w:evenVBand="0" w:oddHBand="0" w:evenHBand="0" w:firstRowFirstColumn="0" w:firstRowLastColumn="0" w:lastRowFirstColumn="0" w:lastRowLastColumn="0"/>
-            <w:tcW w:w="2880" w:type="dxa"/>
+            <w:tcW w:w="3480" w:type="dxa"/>
           </w:tcPr>
           <w:p>
             <w:r>
@@ -11721,7 +11725,7 @@
         </w:tc>
         <w:tc>
           <w:tcPr>
-            <w:tcW w:w="2880" w:type="dxa"/>
+            <w:tcW w:w="3750" w:type="dxa"/>
           </w:tcPr>
           <w:p>
             <w:pPr>
@@ -11734,7 +11738,7 @@
         </w:tc>
         <w:tc>
           <w:tcPr>
-            <w:tcW w:w="2880" w:type="dxa"/>
+            <w:tcW w:w="1410" w:type="dxa"/>
           </w:tcPr>
           <w:p>
             <w:pPr>
@@ -11753,7 +11757,7 @@
         <w:tc>
           <w:tcPr>
             <w:cnfStyle w:val="001000000000" w:firstRow="0" w:lastRow="0" w:firstColumn="1" w:lastColumn="0" w:oddVBand="0" w:evenVBand="0" w:oddHBand="0" w:evenHBand="0" w:firstRowFirstColumn="0" w:firstRowLastColumn="0" w:lastRowFirstColumn="0" w:lastRowLastColumn="0"/>
-            <w:tcW w:w="2880" w:type="dxa"/>
+            <w:tcW w:w="3480" w:type="dxa"/>
           </w:tcPr>
           <w:p>
             <w:r>
@@ -11763,7 +11767,7 @@
         </w:tc>
         <w:tc>
           <w:tcPr>
-            <w:tcW w:w="2880" w:type="dxa"/>
+            <w:tcW w:w="3750" w:type="dxa"/>
           </w:tcPr>
           <w:p>
             <w:pPr>
@@ -11776,7 +11780,7 @@
         </w:tc>
         <w:tc>
           <w:tcPr>
-            <w:tcW w:w="2880" w:type="dxa"/>
+            <w:tcW w:w="1410" w:type="dxa"/>
           </w:tcPr>
           <w:p>
             <w:pPr>
@@ -11792,7 +11796,7 @@
         <w:tc>
           <w:tcPr>
             <w:cnfStyle w:val="001000000000" w:firstRow="0" w:lastRow="0" w:firstColumn="1" w:lastColumn="0" w:oddVBand="0" w:evenVBand="0" w:oddHBand="0" w:evenHBand="0" w:firstRowFirstColumn="0" w:firstRowLastColumn="0" w:lastRowFirstColumn="0" w:lastRowLastColumn="0"/>
-            <w:tcW w:w="2880" w:type="dxa"/>
+            <w:tcW w:w="3480" w:type="dxa"/>
           </w:tcPr>
           <w:p>
             <w:r>
@@ -11802,7 +11806,7 @@
         </w:tc>
         <w:tc>
           <w:tcPr>
-            <w:tcW w:w="2880" w:type="dxa"/>
+            <w:tcW w:w="3750" w:type="dxa"/>
           </w:tcPr>
           <w:p>
             <w:pPr>
@@ -11815,7 +11819,7 @@
         </w:tc>
         <w:tc>
           <w:tcPr>
-            <w:tcW w:w="2880" w:type="dxa"/>
+            <w:tcW w:w="1410" w:type="dxa"/>
           </w:tcPr>
           <w:p>
             <w:pPr>
@@ -11834,7 +11838,7 @@
         <w:tc>
           <w:tcPr>
             <w:cnfStyle w:val="001000000000" w:firstRow="0" w:lastRow="0" w:firstColumn="1" w:lastColumn="0" w:oddVBand="0" w:evenVBand="0" w:oddHBand="0" w:evenHBand="0" w:firstRowFirstColumn="0" w:firstRowLastColumn="0" w:lastRowFirstColumn="0" w:lastRowLastColumn="0"/>
-            <w:tcW w:w="2880" w:type="dxa"/>
+            <w:tcW w:w="3480" w:type="dxa"/>
           </w:tcPr>
           <w:p>
             <w:r>
@@ -11844,7 +11848,7 @@
         </w:tc>
         <w:tc>
           <w:tcPr>
-            <w:tcW w:w="2880" w:type="dxa"/>
+            <w:tcW w:w="3750" w:type="dxa"/>
           </w:tcPr>
           <w:p>
             <w:pPr>
@@ -11857,7 +11861,7 @@
         </w:tc>
         <w:tc>
           <w:tcPr>
-            <w:tcW w:w="2880" w:type="dxa"/>
+            <w:tcW w:w="1410" w:type="dxa"/>
           </w:tcPr>
           <w:p>
             <w:pPr>
@@ -11873,7 +11877,7 @@
         <w:tc>
           <w:tcPr>
             <w:cnfStyle w:val="001000000000" w:firstRow="0" w:lastRow="0" w:firstColumn="1" w:lastColumn="0" w:oddVBand="0" w:evenVBand="0" w:oddHBand="0" w:evenHBand="0" w:firstRowFirstColumn="0" w:firstRowLastColumn="0" w:lastRowFirstColumn="0" w:lastRowLastColumn="0"/>
-            <w:tcW w:w="2880" w:type="dxa"/>
+            <w:tcW w:w="3480" w:type="dxa"/>
           </w:tcPr>
           <w:p>
             <w:r>
@@ -11883,7 +11887,7 @@
         </w:tc>
         <w:tc>
           <w:tcPr>
-            <w:tcW w:w="2880" w:type="dxa"/>
+            <w:tcW w:w="3750" w:type="dxa"/>
           </w:tcPr>
           <w:p>
             <w:pPr>
@@ -11896,7 +11900,7 @@
         </w:tc>
         <w:tc>
           <w:tcPr>
-            <w:tcW w:w="2880" w:type="dxa"/>
+            <w:tcW w:w="1410" w:type="dxa"/>
           </w:tcPr>
           <w:p>
             <w:pPr>
@@ -11915,7 +11919,7 @@
         <w:tc>
           <w:tcPr>
             <w:cnfStyle w:val="001000000000" w:firstRow="0" w:lastRow="0" w:firstColumn="1" w:lastColumn="0" w:oddVBand="0" w:evenVBand="0" w:oddHBand="0" w:evenHBand="0" w:firstRowFirstColumn="0" w:firstRowLastColumn="0" w:lastRowFirstColumn="0" w:lastRowLastColumn="0"/>
-            <w:tcW w:w="2880" w:type="dxa"/>
+            <w:tcW w:w="3480" w:type="dxa"/>
           </w:tcPr>
           <w:p>
             <w:r>
@@ -11925,7 +11929,7 @@
         </w:tc>
         <w:tc>
           <w:tcPr>
-            <w:tcW w:w="2880" w:type="dxa"/>
+            <w:tcW w:w="3750" w:type="dxa"/>
           </w:tcPr>
           <w:p>
             <w:pPr>
@@ -11938,7 +11942,7 @@
         </w:tc>
         <w:tc>
           <w:tcPr>
-            <w:tcW w:w="2880" w:type="dxa"/>
+            <w:tcW w:w="1410" w:type="dxa"/>
           </w:tcPr>
           <w:p>
             <w:pPr>
@@ -11954,7 +11958,7 @@
         <w:tc>
           <w:tcPr>
             <w:cnfStyle w:val="001000000000" w:firstRow="0" w:lastRow="0" w:firstColumn="1" w:lastColumn="0" w:oddVBand="0" w:evenVBand="0" w:oddHBand="0" w:evenHBand="0" w:firstRowFirstColumn="0" w:firstRowLastColumn="0" w:lastRowFirstColumn="0" w:lastRowLastColumn="0"/>
-            <w:tcW w:w="2880" w:type="dxa"/>
+            <w:tcW w:w="3480" w:type="dxa"/>
           </w:tcPr>
           <w:p>
             <w:r>
@@ -11964,7 +11968,7 @@
         </w:tc>
         <w:tc>
           <w:tcPr>
-            <w:tcW w:w="2880" w:type="dxa"/>
+            <w:tcW w:w="3750" w:type="dxa"/>
           </w:tcPr>
           <w:p>
             <w:pPr>
@@ -11977,7 +11981,7 @@
         </w:tc>
         <w:tc>
           <w:tcPr>
-            <w:tcW w:w="2880" w:type="dxa"/>
+            <w:tcW w:w="1410" w:type="dxa"/>
           </w:tcPr>
           <w:p>
             <w:pPr>
@@ -14528,17 +14532,19 @@
         <w:fldChar w:fldCharType="end"/>
       </w:r>
       <w:r>
-        <w:t xml:space="preserve"> - </w:t>
-      </w:r>
+        <w:t xml:space="preserve"> </w:t>
+      </w:r>
+      <w:r>
+        <w:t>–</w:t>
+      </w:r>
+      <w:r>
+        <w:t xml:space="preserve"> </w:t>
+      </w:r>
+      <w:proofErr w:type="spellStart"/>
       <w:r>
         <w:t>linkEntitiesAcrossRegions</w:t>
       </w:r>
-    </w:p>
-    <w:p>
-      <w:r>
-        <w:lastRenderedPageBreak/>
-        <w:br w:type="page"/>
-      </w:r>
+      <w:proofErr w:type="spellEnd"/>
     </w:p>
     <w:p>
       <w:pPr>
@@ -25948,7 +25954,7 @@
   <w:abstractNum w:abstractNumId="8" w15:restartNumberingAfterBreak="0">
     <w:nsid w:val="FFFFFF89"/>
     <w:multiLevelType w:val="singleLevel"/>
-    <w:tmpl w:val="29761A62"/>
+    <w:tmpl w:val="25186C2C"/>
     <w:lvl w:ilvl="0">
       <w:start w:val="1"/>
       <w:numFmt w:val="bullet"/>

</xml_diff>